<commit_message>
Remove manual end marker from copyright docs
</commit_message>
<xml_diff>
--- a/软件著作权申请文件-量子代码大模型研发平台软件V1.0/设计说明书及使用说明文档-量子代码大模型研发平台软件V1.0.docx
+++ b/软件著作权申请文件-量子代码大模型研发平台软件V1.0/设计说明书及使用说明文档-量子代码大模型研发平台软件V1.0.docx
@@ -7350,7 +7350,7 @@
           <w:color w:val="000000"/>
           <w:sz w:val="22"/>
         </w:rPr>
-        <w:t>交付复核应逐项检查说明文档和源程序文件：说明文档看封面、目录、标题层级、图示、软件运行插图、页眉页码、黑色字体和结束标志；源程序看页数、行数、页眉页码、可见行号和末页结束标志。</w:t>
+        <w:t>交付复核应逐项检查说明文档和源程序文件：说明文档看封面、目录、标题层级、图示、软件运行插图、页眉页码、黑色字体和末页正文收束；源程序看页数、行数、页眉页码、可见行号和末页结束标志。</w:t>
       </w:r>
     </w:p>
     <w:p>
@@ -7590,7 +7590,7 @@
           <w:color w:val="000000"/>
           <w:sz w:val="22"/>
         </w:rPr>
-        <w:t>设计说明书及使用说明文档采用封面、目录、一级标题、二级标题、自然段、表格、图示、软件运行界面插图、页眉页码和末页结束标志的Word结构，整体保持黑色文字和黑白灰图示风格。</w:t>
+        <w:t>设计说明书及使用说明文档采用封面、目录、一级标题、二级标题、自然段、表格、图示、软件运行界面插图和页眉页码的Word结构，末页以正文自然收束，整体保持黑色文字和黑白灰图示风格。</w:t>
       </w:r>
     </w:p>
     <w:p>
@@ -7846,7 +7846,7 @@
           <w:color w:val="000000"/>
           <w:sz w:val="22"/>
         </w:rPr>
-        <w:t>对格式质量的最终判断也不只看DOCX是否能打开。应使用LibreOffice或等效工具转成PDF后查看实际分页、目录对齐、图表位置、页眉页码、字体颜色和末尾结束标志，因为这些问题在Word编辑视图中不一定明显。</w:t>
+        <w:t>对格式质量的最终判断也不只看DOCX是否能打开。应使用LibreOffice或等效工具转成PDF后查看实际分页、目录对齐、图表位置、页眉页码、字体颜色和末页段落收束，因为这些问题在Word编辑视图中不一定明显。</w:t>
       </w:r>
     </w:p>
     <w:p>
@@ -8118,7 +8118,7 @@
           <w:color w:val="000000"/>
           <w:sz w:val="22"/>
         </w:rPr>
-        <w:t>end</w:t>
+        <w:t>后续维护时，应以当前批次为基准记录差异，先确认功能范围、运行入口、报告格式和源程序行号，再生成新的说明书和复核清单。</w:t>
       </w:r>
     </w:p>
     <w:sectPr>

</xml_diff>